<commit_message>
Drop group-leader label from member lists
Co-Authored-By: Claude Opus 5.5 <noreply@anthropic.com>
</commit_message>
<xml_diff>
--- a/docs/B2车间通道通行_课程报告.docx
+++ b/docs/B2车间通道通行_课程报告.docx
@@ -90,33 +90,13 @@
           <w:b/>
           <w:sz w:val="26"/>
         </w:rPr>
-        <w:t>组    长：</w:t>
+        <w:t>成    员：</w:t>
       </w:r>
       <w:r>
         <w:rPr>
           <w:sz w:val="26"/>
         </w:rPr>
-        <w:t>教晔廷</w:t>
-      </w:r>
-    </w:p>
-    <w:p>
-      <w:pPr>
-        <w:spacing w:line="432" w:lineRule="auto"/>
-        <w:ind w:left="1814"/>
-      </w:pPr>
-      <w:r>
-        <w:rPr>
-          <w:rFonts w:ascii="Times New Roman" w:hAnsi="Times New Roman" w:eastAsia="黑体"/>
-          <w:b/>
-          <w:sz w:val="26"/>
-        </w:rPr>
-        <w:t>组    员：</w:t>
-      </w:r>
-      <w:r>
-        <w:rPr>
-          <w:sz w:val="26"/>
-        </w:rPr>
-        <w:t>臧文韬、牛麒皓、张欣、苏奕婷</w:t>
+        <w:t>教晔廷、臧文韬、牛麒皓、张欣、苏奕婷</w:t>
       </w:r>
     </w:p>
     <w:p>
@@ -4431,7 +4411,7 @@
         <w:ind w:firstLine="480"/>
       </w:pPr>
       <w:r>
-        <w:t>第一组成员：教晔廷（组长）、臧文韬、牛麒皓、张欣、苏奕婷。按课程给出的五个角色分工如下。</w:t>
+        <w:t>第一组成员：教晔廷、臧文韬、牛麒皓、张欣、苏奕婷。按课程给出的五个角色分工如下。</w:t>
       </w:r>
     </w:p>
     <w:p>

</xml_diff>

<commit_message>
Assign members to roles
Co-Authored-By: Claude Opus 5.5 <noreply@anthropic.com>
</commit_message>
<xml_diff>
--- a/docs/B2车间通道通行_课程报告.docx
+++ b/docs/B2车间通道通行_课程报告.docx
@@ -4552,7 +4552,7 @@
               <w:rPr>
                 <w:sz w:val="21"/>
               </w:rPr>
-              <w:t>[姓名]</w:t>
+              <w:t>教晔廷</w:t>
             </w:r>
           </w:p>
         </w:tc>
@@ -4614,7 +4614,7 @@
               <w:rPr>
                 <w:sz w:val="21"/>
               </w:rPr>
-              <w:t>[姓名]</w:t>
+              <w:t>臧文韬</w:t>
             </w:r>
           </w:p>
         </w:tc>
@@ -4676,7 +4676,7 @@
               <w:rPr>
                 <w:sz w:val="21"/>
               </w:rPr>
-              <w:t>[姓名]</w:t>
+              <w:t>牛麒皓</w:t>
             </w:r>
           </w:p>
         </w:tc>
@@ -4738,7 +4738,7 @@
               <w:rPr>
                 <w:sz w:val="21"/>
               </w:rPr>
-              <w:t>[姓名]</w:t>
+              <w:t>张欣</w:t>
             </w:r>
           </w:p>
         </w:tc>
@@ -4800,7 +4800,7 @@
               <w:rPr>
                 <w:sz w:val="21"/>
               </w:rPr>
-              <w:t>[姓名]</w:t>
+              <w:t>苏奕婷</w:t>
             </w:r>
           </w:p>
         </w:tc>

</xml_diff>